<commit_message>
fix: revert QR code to GitHub Pages URL, regen docx
</commit_message>
<xml_diff>
--- a/使用教程.docx
+++ b/使用教程.docx
@@ -7,7 +7,7 @@
       <w:pPr>
         <w:pStyle w:val="1"/>
         <w:shd w:val="clear" w:color="auto" w:fill="FFFFFF"/>
-        <w:divId w:val="2038851442"/>
+        <w:divId w:val="609123552"/>
         <w:rPr>
           <w:rFonts w:ascii="微软雅黑" w:eastAsia="微软雅黑" w:hAnsi="微软雅黑"/>
         </w:rPr>
@@ -47,7 +47,7 @@
       <w:pPr>
         <w:pStyle w:val="2"/>
         <w:shd w:val="clear" w:color="auto" w:fill="FFFFFF"/>
-        <w:divId w:val="2038851442"/>
+        <w:divId w:val="609123552"/>
         <w:rPr>
           <w:rFonts w:ascii="微软雅黑" w:eastAsia="微软雅黑" w:hAnsi="微软雅黑" w:hint="eastAsia"/>
         </w:rPr>
@@ -76,7 +76,7 @@
       </w:tblGrid>
       <w:tr>
         <w:trPr>
-          <w:divId w:val="2038851442"/>
+          <w:divId w:val="609123552"/>
         </w:trPr>
         <w:tc>
           <w:tcPr>
@@ -273,7 +273,7 @@
       </w:tr>
       <w:tr>
         <w:trPr>
-          <w:divId w:val="2038851442"/>
+          <w:divId w:val="609123552"/>
         </w:trPr>
         <w:tc>
           <w:tcPr>
@@ -488,7 +488,7 @@
       </w:tr>
       <w:tr>
         <w:trPr>
-          <w:divId w:val="2038851442"/>
+          <w:divId w:val="609123552"/>
         </w:trPr>
         <w:tc>
           <w:tcPr>
@@ -638,7 +638,7 @@
       </w:tr>
       <w:tr>
         <w:trPr>
-          <w:divId w:val="2038851442"/>
+          <w:divId w:val="609123552"/>
         </w:trPr>
         <w:tc>
           <w:tcPr>
@@ -765,7 +765,7 @@
     <w:p>
       <w:pPr>
         <w:shd w:val="clear" w:color="auto" w:fill="FFF8E1"/>
-        <w:divId w:val="1748456754"/>
+        <w:divId w:val="55469197"/>
         <w:rPr>
           <w:rFonts w:ascii="微软雅黑" w:eastAsia="微软雅黑" w:hAnsi="微软雅黑" w:hint="eastAsia"/>
           <w:color w:val="333333"/>
@@ -823,7 +823,7 @@
       <w:pPr>
         <w:pStyle w:val="2"/>
         <w:shd w:val="clear" w:color="auto" w:fill="FFFFFF"/>
-        <w:divId w:val="2038851442"/>
+        <w:divId w:val="609123552"/>
         <w:rPr>
           <w:rFonts w:ascii="微软雅黑" w:eastAsia="微软雅黑" w:hAnsi="微软雅黑" w:hint="eastAsia"/>
         </w:rPr>
@@ -838,7 +838,7 @@
     <w:p>
       <w:pPr>
         <w:shd w:val="clear" w:color="auto" w:fill="FFF8E1"/>
-        <w:divId w:val="2029526888"/>
+        <w:divId w:val="499079357"/>
         <w:rPr>
           <w:rFonts w:ascii="微软雅黑" w:eastAsia="微软雅黑" w:hAnsi="微软雅黑" w:hint="eastAsia"/>
           <w:color w:val="333333"/>
@@ -896,7 +896,7 @@
       <w:pPr>
         <w:pStyle w:val="3"/>
         <w:shd w:val="clear" w:color="auto" w:fill="FFFFFF"/>
-        <w:divId w:val="2038851442"/>
+        <w:divId w:val="609123552"/>
         <w:rPr>
           <w:rFonts w:ascii="微软雅黑" w:eastAsia="微软雅黑" w:hAnsi="微软雅黑" w:hint="eastAsia"/>
         </w:rPr>
@@ -928,7 +928,7 @@
         </w:numPr>
         <w:shd w:val="clear" w:color="auto" w:fill="FFFFFF"/>
         <w:spacing w:before="60" w:after="60"/>
-        <w:divId w:val="2038851442"/>
+        <w:divId w:val="609123552"/>
         <w:rPr>
           <w:rFonts w:ascii="微软雅黑" w:eastAsia="微软雅黑" w:hAnsi="微软雅黑" w:hint="eastAsia"/>
           <w:color w:val="333333"/>
@@ -979,7 +979,7 @@
         </w:numPr>
         <w:shd w:val="clear" w:color="auto" w:fill="FFFFFF"/>
         <w:spacing w:before="60" w:after="60"/>
-        <w:divId w:val="2038851442"/>
+        <w:divId w:val="609123552"/>
         <w:rPr>
           <w:rFonts w:ascii="微软雅黑" w:eastAsia="微软雅黑" w:hAnsi="微软雅黑" w:hint="eastAsia"/>
           <w:color w:val="333333"/>
@@ -1059,7 +1059,7 @@
         </w:numPr>
         <w:shd w:val="clear" w:color="auto" w:fill="FFFFFF"/>
         <w:spacing w:before="60" w:after="60"/>
-        <w:divId w:val="2038851442"/>
+        <w:divId w:val="609123552"/>
         <w:rPr>
           <w:rFonts w:ascii="微软雅黑" w:eastAsia="微软雅黑" w:hAnsi="微软雅黑" w:hint="eastAsia"/>
           <w:color w:val="333333"/>
@@ -1117,7 +1117,7 @@
         </w:numPr>
         <w:shd w:val="clear" w:color="auto" w:fill="FFFFFF"/>
         <w:spacing w:before="60" w:after="60"/>
-        <w:divId w:val="2038851442"/>
+        <w:divId w:val="609123552"/>
         <w:rPr>
           <w:rFonts w:ascii="微软雅黑" w:eastAsia="微软雅黑" w:hAnsi="微软雅黑" w:hint="eastAsia"/>
           <w:color w:val="333333"/>
@@ -1157,7 +1157,7 @@
       <w:pPr>
         <w:pStyle w:val="a3"/>
         <w:shd w:val="clear" w:color="auto" w:fill="FFFFFF"/>
-        <w:divId w:val="2038851442"/>
+        <w:divId w:val="609123552"/>
         <w:rPr>
           <w:rFonts w:ascii="微软雅黑" w:eastAsia="微软雅黑" w:hAnsi="微软雅黑" w:hint="eastAsia"/>
           <w:color w:val="333333"/>
@@ -1189,7 +1189,7 @@
       <w:pPr>
         <w:pStyle w:val="3"/>
         <w:shd w:val="clear" w:color="auto" w:fill="FFFFFF"/>
-        <w:divId w:val="2038851442"/>
+        <w:divId w:val="609123552"/>
         <w:rPr>
           <w:rFonts w:ascii="微软雅黑" w:eastAsia="微软雅黑" w:hAnsi="微软雅黑" w:hint="eastAsia"/>
         </w:rPr>
@@ -1221,7 +1221,7 @@
         </w:numPr>
         <w:shd w:val="clear" w:color="auto" w:fill="FFFFFF"/>
         <w:spacing w:before="60" w:after="60"/>
-        <w:divId w:val="2038851442"/>
+        <w:divId w:val="609123552"/>
         <w:rPr>
           <w:rFonts w:ascii="微软雅黑" w:eastAsia="微软雅黑" w:hAnsi="微软雅黑" w:hint="eastAsia"/>
           <w:color w:val="333333"/>
@@ -1264,7 +1264,7 @@
         </w:numPr>
         <w:shd w:val="clear" w:color="auto" w:fill="FFFFFF"/>
         <w:spacing w:before="60" w:after="60"/>
-        <w:divId w:val="2038851442"/>
+        <w:divId w:val="609123552"/>
         <w:rPr>
           <w:rFonts w:ascii="微软雅黑" w:eastAsia="微软雅黑" w:hAnsi="微软雅黑" w:hint="eastAsia"/>
           <w:color w:val="333333"/>
@@ -1316,7 +1316,7 @@
         </w:numPr>
         <w:shd w:val="clear" w:color="auto" w:fill="FFFFFF"/>
         <w:spacing w:before="60" w:after="60"/>
-        <w:divId w:val="2038851442"/>
+        <w:divId w:val="609123552"/>
         <w:rPr>
           <w:rFonts w:ascii="微软雅黑" w:eastAsia="微软雅黑" w:hAnsi="微软雅黑" w:hint="eastAsia"/>
           <w:color w:val="333333"/>
@@ -1374,7 +1374,7 @@
       <w:pPr>
         <w:pStyle w:val="3"/>
         <w:shd w:val="clear" w:color="auto" w:fill="FFFFFF"/>
-        <w:divId w:val="2038851442"/>
+        <w:divId w:val="609123552"/>
         <w:rPr>
           <w:rFonts w:ascii="微软雅黑" w:eastAsia="微软雅黑" w:hAnsi="微软雅黑" w:hint="eastAsia"/>
         </w:rPr>
@@ -1395,7 +1395,7 @@
         </w:numPr>
         <w:shd w:val="clear" w:color="auto" w:fill="FFFFFF"/>
         <w:spacing w:before="60" w:after="60"/>
-        <w:divId w:val="2038851442"/>
+        <w:divId w:val="609123552"/>
         <w:rPr>
           <w:rFonts w:ascii="微软雅黑" w:eastAsia="微软雅黑" w:hAnsi="微软雅黑" w:hint="eastAsia"/>
           <w:color w:val="333333"/>
@@ -1477,7 +1477,7 @@
         </w:numPr>
         <w:shd w:val="clear" w:color="auto" w:fill="FFFFFF"/>
         <w:spacing w:before="60" w:after="60"/>
-        <w:divId w:val="2038851442"/>
+        <w:divId w:val="609123552"/>
         <w:rPr>
           <w:rFonts w:ascii="微软雅黑" w:eastAsia="微软雅黑" w:hAnsi="微软雅黑" w:hint="eastAsia"/>
           <w:color w:val="333333"/>
@@ -1520,7 +1520,7 @@
         </w:numPr>
         <w:shd w:val="clear" w:color="auto" w:fill="FFFFFF"/>
         <w:spacing w:before="60" w:after="60"/>
-        <w:divId w:val="2038851442"/>
+        <w:divId w:val="609123552"/>
         <w:rPr>
           <w:rFonts w:ascii="微软雅黑" w:eastAsia="微软雅黑" w:hAnsi="微软雅黑" w:hint="eastAsia"/>
           <w:color w:val="333333"/>
@@ -1581,7 +1581,7 @@
         </w:numPr>
         <w:shd w:val="clear" w:color="auto" w:fill="FFFFFF"/>
         <w:spacing w:before="60" w:after="60"/>
-        <w:divId w:val="2038851442"/>
+        <w:divId w:val="609123552"/>
         <w:rPr>
           <w:rFonts w:ascii="微软雅黑" w:eastAsia="微软雅黑" w:hAnsi="微软雅黑" w:hint="eastAsia"/>
           <w:color w:val="333333"/>
@@ -1602,7 +1602,7 @@
     <w:p>
       <w:pPr>
         <w:shd w:val="clear" w:color="auto" w:fill="FFF8E1"/>
-        <w:divId w:val="920259819"/>
+        <w:divId w:val="508524971"/>
         <w:rPr>
           <w:rFonts w:ascii="微软雅黑" w:eastAsia="微软雅黑" w:hAnsi="微软雅黑" w:hint="eastAsia"/>
           <w:color w:val="333333"/>
@@ -1711,7 +1711,7 @@
       <w:pPr>
         <w:pStyle w:val="3"/>
         <w:shd w:val="clear" w:color="auto" w:fill="FFFFFF"/>
-        <w:divId w:val="2038851442"/>
+        <w:divId w:val="609123552"/>
         <w:rPr>
           <w:rFonts w:ascii="微软雅黑" w:eastAsia="微软雅黑" w:hAnsi="微软雅黑" w:hint="eastAsia"/>
         </w:rPr>
@@ -1731,7 +1731,7 @@
         </w:numPr>
         <w:shd w:val="clear" w:color="auto" w:fill="FFFFFF"/>
         <w:spacing w:before="60" w:after="60"/>
-        <w:divId w:val="2038851442"/>
+        <w:divId w:val="609123552"/>
         <w:rPr>
           <w:rFonts w:ascii="微软雅黑" w:eastAsia="微软雅黑" w:hAnsi="微软雅黑" w:hint="eastAsia"/>
           <w:color w:val="333333"/>
@@ -1768,7 +1768,7 @@
         </w:numPr>
         <w:shd w:val="clear" w:color="auto" w:fill="FFFFFF"/>
         <w:spacing w:before="60" w:after="60"/>
-        <w:divId w:val="2038851442"/>
+        <w:divId w:val="609123552"/>
         <w:rPr>
           <w:rFonts w:ascii="微软雅黑" w:eastAsia="微软雅黑" w:hAnsi="微软雅黑" w:hint="eastAsia"/>
           <w:color w:val="333333"/>
@@ -1843,7 +1843,7 @@
       <w:pPr>
         <w:pStyle w:val="2"/>
         <w:shd w:val="clear" w:color="auto" w:fill="FFFFFF"/>
-        <w:divId w:val="2038851442"/>
+        <w:divId w:val="609123552"/>
         <w:rPr>
           <w:rFonts w:ascii="微软雅黑" w:eastAsia="微软雅黑" w:hAnsi="微软雅黑" w:hint="eastAsia"/>
         </w:rPr>
@@ -1859,7 +1859,7 @@
       <w:pPr>
         <w:pStyle w:val="3"/>
         <w:shd w:val="clear" w:color="auto" w:fill="FFFFFF"/>
-        <w:divId w:val="2038851442"/>
+        <w:divId w:val="609123552"/>
         <w:rPr>
           <w:rFonts w:ascii="微软雅黑" w:eastAsia="微软雅黑" w:hAnsi="微软雅黑" w:hint="eastAsia"/>
         </w:rPr>
@@ -1875,7 +1875,7 @@
       <w:pPr>
         <w:pStyle w:val="a3"/>
         <w:shd w:val="clear" w:color="auto" w:fill="FFFFFF"/>
-        <w:divId w:val="2038851442"/>
+        <w:divId w:val="609123552"/>
         <w:rPr>
           <w:rFonts w:ascii="微软雅黑" w:eastAsia="微软雅黑" w:hAnsi="微软雅黑" w:hint="eastAsia"/>
           <w:color w:val="333333"/>
@@ -1895,7 +1895,7 @@
         <w:shd w:val="clear" w:color="auto" w:fill="FFFFFF"/>
         <w:spacing w:before="180" w:after="180"/>
         <w:jc w:val="center"/>
-        <w:divId w:val="2038851442"/>
+        <w:divId w:val="609123552"/>
         <w:rPr>
           <w:rFonts w:ascii="微软雅黑" w:eastAsia="微软雅黑" w:hAnsi="微软雅黑" w:hint="eastAsia"/>
           <w:color w:val="333333"/>
@@ -1908,7 +1908,7 @@
           <w:color w:val="333333"/>
         </w:rPr>
         <w:drawing>
-          <wp:inline distT="0" distB="0" distL="0" distR="0" wp14:anchorId="359BF5B8" wp14:editId="3B2E636B">
+          <wp:inline distT="0" distB="0" distL="0" distR="0" wp14:anchorId="3D94EB13" wp14:editId="150B1C89">
             <wp:extent cx="1905000" cy="1905000"/>
             <wp:effectExtent l="0" t="0" r="0" b="0"/>
             <wp:docPr id="1" name="图片 1" descr="扫码打开家长留言板"/>
@@ -1962,7 +1962,7 @@
         <w:pStyle w:val="a3"/>
         <w:shd w:val="clear" w:color="auto" w:fill="FFFFFF"/>
         <w:jc w:val="center"/>
-        <w:divId w:val="2038851442"/>
+        <w:divId w:val="609123552"/>
         <w:rPr>
           <w:rFonts w:ascii="微软雅黑" w:eastAsia="微软雅黑" w:hAnsi="微软雅黑" w:hint="eastAsia"/>
           <w:color w:val="888888"/>
@@ -1985,14 +1985,14 @@
           <w:rFonts w:hint="eastAsia"/>
           <w:color w:val="888888"/>
         </w:rPr>
-        <w:t>https://1437238162-ho33k071it.ap-guangzhou.tencentscf.com</w:t>
+        <w:t>https://wl-123888.github.io/liuyanban/</w:t>
       </w:r>
     </w:p>
     <w:p>
       <w:pPr>
         <w:pStyle w:val="3"/>
         <w:shd w:val="clear" w:color="auto" w:fill="FFFFFF"/>
-        <w:divId w:val="2038851442"/>
+        <w:divId w:val="609123552"/>
         <w:rPr>
           <w:rFonts w:ascii="微软雅黑" w:eastAsia="微软雅黑" w:hAnsi="微软雅黑" w:hint="eastAsia"/>
         </w:rPr>
@@ -2012,7 +2012,7 @@
         </w:numPr>
         <w:shd w:val="clear" w:color="auto" w:fill="FFFFFF"/>
         <w:spacing w:before="60" w:after="60"/>
-        <w:divId w:val="2038851442"/>
+        <w:divId w:val="609123552"/>
         <w:rPr>
           <w:rFonts w:ascii="微软雅黑" w:eastAsia="微软雅黑" w:hAnsi="微软雅黑" w:hint="eastAsia"/>
           <w:color w:val="333333"/>
@@ -2092,7 +2092,7 @@
         </w:numPr>
         <w:shd w:val="clear" w:color="auto" w:fill="FFFFFF"/>
         <w:spacing w:before="60" w:after="60"/>
-        <w:divId w:val="2038851442"/>
+        <w:divId w:val="609123552"/>
         <w:rPr>
           <w:rFonts w:ascii="微软雅黑" w:eastAsia="微软雅黑" w:hAnsi="微软雅黑" w:hint="eastAsia"/>
           <w:color w:val="333333"/>
@@ -2163,7 +2163,7 @@
         </w:numPr>
         <w:shd w:val="clear" w:color="auto" w:fill="FFFFFF"/>
         <w:spacing w:before="60" w:after="60"/>
-        <w:divId w:val="2038851442"/>
+        <w:divId w:val="609123552"/>
         <w:rPr>
           <w:rFonts w:ascii="微软雅黑" w:eastAsia="微软雅黑" w:hAnsi="微软雅黑" w:hint="eastAsia"/>
           <w:color w:val="333333"/>
@@ -2189,7 +2189,7 @@
         </w:numPr>
         <w:shd w:val="clear" w:color="auto" w:fill="FFFFFF"/>
         <w:spacing w:before="60" w:after="60"/>
-        <w:divId w:val="2038851442"/>
+        <w:divId w:val="609123552"/>
         <w:rPr>
           <w:rFonts w:ascii="微软雅黑" w:eastAsia="微软雅黑" w:hAnsi="微软雅黑" w:hint="eastAsia"/>
           <w:color w:val="333333"/>
@@ -2251,7 +2251,7 @@
         </w:numPr>
         <w:shd w:val="clear" w:color="auto" w:fill="FFFFFF"/>
         <w:spacing w:before="60" w:after="60"/>
-        <w:divId w:val="2038851442"/>
+        <w:divId w:val="609123552"/>
         <w:rPr>
           <w:rFonts w:ascii="微软雅黑" w:eastAsia="微软雅黑" w:hAnsi="微软雅黑" w:hint="eastAsia"/>
           <w:color w:val="333333"/>
@@ -2309,7 +2309,7 @@
       <w:pPr>
         <w:pStyle w:val="3"/>
         <w:shd w:val="clear" w:color="auto" w:fill="FFFFFF"/>
-        <w:divId w:val="2038851442"/>
+        <w:divId w:val="609123552"/>
         <w:rPr>
           <w:rFonts w:ascii="微软雅黑" w:eastAsia="微软雅黑" w:hAnsi="微软雅黑" w:hint="eastAsia"/>
         </w:rPr>
@@ -2329,7 +2329,7 @@
         </w:numPr>
         <w:shd w:val="clear" w:color="auto" w:fill="FFFFFF"/>
         <w:spacing w:before="60" w:after="60"/>
-        <w:divId w:val="2038851442"/>
+        <w:divId w:val="609123552"/>
         <w:rPr>
           <w:rFonts w:ascii="微软雅黑" w:eastAsia="微软雅黑" w:hAnsi="微软雅黑" w:hint="eastAsia"/>
           <w:color w:val="333333"/>
@@ -2373,7 +2373,7 @@
         </w:numPr>
         <w:shd w:val="clear" w:color="auto" w:fill="FFFFFF"/>
         <w:spacing w:before="60" w:after="60"/>
-        <w:divId w:val="2038851442"/>
+        <w:divId w:val="609123552"/>
         <w:rPr>
           <w:rFonts w:ascii="微软雅黑" w:eastAsia="微软雅黑" w:hAnsi="微软雅黑" w:hint="eastAsia"/>
           <w:color w:val="333333"/>
@@ -2399,7 +2399,7 @@
         </w:numPr>
         <w:shd w:val="clear" w:color="auto" w:fill="FFFFFF"/>
         <w:spacing w:before="60" w:after="60"/>
-        <w:divId w:val="2038851442"/>
+        <w:divId w:val="609123552"/>
         <w:rPr>
           <w:rFonts w:ascii="微软雅黑" w:eastAsia="微软雅黑" w:hAnsi="微软雅黑" w:hint="eastAsia"/>
           <w:color w:val="333333"/>
@@ -2421,7 +2421,7 @@
       <w:pPr>
         <w:pStyle w:val="2"/>
         <w:shd w:val="clear" w:color="auto" w:fill="FFFFFF"/>
-        <w:divId w:val="2038851442"/>
+        <w:divId w:val="609123552"/>
         <w:rPr>
           <w:rFonts w:ascii="微软雅黑" w:eastAsia="微软雅黑" w:hAnsi="微软雅黑" w:hint="eastAsia"/>
         </w:rPr>
@@ -2437,7 +2437,7 @@
       <w:pPr>
         <w:pStyle w:val="3"/>
         <w:shd w:val="clear" w:color="auto" w:fill="FFFFFF"/>
-        <w:divId w:val="2038851442"/>
+        <w:divId w:val="609123552"/>
         <w:rPr>
           <w:rFonts w:ascii="微软雅黑" w:eastAsia="微软雅黑" w:hAnsi="微软雅黑" w:hint="eastAsia"/>
         </w:rPr>
@@ -2453,7 +2453,7 @@
       <w:pPr>
         <w:pStyle w:val="a3"/>
         <w:shd w:val="clear" w:color="auto" w:fill="FFFFFF"/>
-        <w:divId w:val="2038851442"/>
+        <w:divId w:val="609123552"/>
         <w:rPr>
           <w:rFonts w:ascii="微软雅黑" w:eastAsia="微软雅黑" w:hAnsi="微软雅黑" w:hint="eastAsia"/>
           <w:color w:val="333333"/>
@@ -2508,7 +2508,7 @@
       <w:pPr>
         <w:pStyle w:val="a3"/>
         <w:shd w:val="clear" w:color="auto" w:fill="FFFFFF"/>
-        <w:divId w:val="2038851442"/>
+        <w:divId w:val="609123552"/>
         <w:rPr>
           <w:rFonts w:ascii="微软雅黑" w:eastAsia="微软雅黑" w:hAnsi="微软雅黑" w:hint="eastAsia"/>
           <w:color w:val="333333"/>
@@ -2530,7 +2530,7 @@
         </w:numPr>
         <w:shd w:val="clear" w:color="auto" w:fill="FFFFFF"/>
         <w:spacing w:before="60" w:after="60"/>
-        <w:divId w:val="2038851442"/>
+        <w:divId w:val="609123552"/>
         <w:rPr>
           <w:rFonts w:ascii="微软雅黑" w:eastAsia="微软雅黑" w:hAnsi="微软雅黑" w:hint="eastAsia"/>
           <w:color w:val="333333"/>
@@ -2612,7 +2612,7 @@
         </w:numPr>
         <w:shd w:val="clear" w:color="auto" w:fill="FFFFFF"/>
         <w:spacing w:before="60" w:after="60"/>
-        <w:divId w:val="2038851442"/>
+        <w:divId w:val="609123552"/>
         <w:rPr>
           <w:rFonts w:ascii="微软雅黑" w:eastAsia="微软雅黑" w:hAnsi="微软雅黑" w:hint="eastAsia"/>
           <w:color w:val="333333"/>
@@ -2690,7 +2690,7 @@
       <w:pPr>
         <w:pStyle w:val="3"/>
         <w:shd w:val="clear" w:color="auto" w:fill="FFFFFF"/>
-        <w:divId w:val="2038851442"/>
+        <w:divId w:val="609123552"/>
         <w:rPr>
           <w:rFonts w:ascii="微软雅黑" w:eastAsia="微软雅黑" w:hAnsi="微软雅黑" w:hint="eastAsia"/>
         </w:rPr>
@@ -2710,7 +2710,7 @@
         </w:numPr>
         <w:shd w:val="clear" w:color="auto" w:fill="FFFFFF"/>
         <w:spacing w:before="60" w:after="60"/>
-        <w:divId w:val="2038851442"/>
+        <w:divId w:val="609123552"/>
         <w:rPr>
           <w:rFonts w:ascii="微软雅黑" w:eastAsia="微软雅黑" w:hAnsi="微软雅黑" w:hint="eastAsia"/>
           <w:color w:val="333333"/>
@@ -2772,7 +2772,7 @@
         </w:numPr>
         <w:shd w:val="clear" w:color="auto" w:fill="FFFFFF"/>
         <w:spacing w:before="60" w:after="60"/>
-        <w:divId w:val="2038851442"/>
+        <w:divId w:val="609123552"/>
         <w:rPr>
           <w:rFonts w:ascii="微软雅黑" w:eastAsia="微软雅黑" w:hAnsi="微软雅黑" w:hint="eastAsia"/>
           <w:color w:val="333333"/>
@@ -2879,7 +2879,7 @@
         </w:numPr>
         <w:shd w:val="clear" w:color="auto" w:fill="FFFFFF"/>
         <w:spacing w:before="60" w:after="60"/>
-        <w:divId w:val="2038851442"/>
+        <w:divId w:val="609123552"/>
         <w:rPr>
           <w:rFonts w:ascii="微软雅黑" w:eastAsia="微软雅黑" w:hAnsi="微软雅黑" w:hint="eastAsia"/>
           <w:color w:val="333333"/>
@@ -2901,7 +2901,7 @@
       <w:pPr>
         <w:pStyle w:val="3"/>
         <w:shd w:val="clear" w:color="auto" w:fill="FFFFFF"/>
-        <w:divId w:val="2038851442"/>
+        <w:divId w:val="609123552"/>
         <w:rPr>
           <w:rFonts w:ascii="微软雅黑" w:eastAsia="微软雅黑" w:hAnsi="微软雅黑" w:hint="eastAsia"/>
         </w:rPr>
@@ -2921,7 +2921,7 @@
         </w:numPr>
         <w:shd w:val="clear" w:color="auto" w:fill="FFFFFF"/>
         <w:spacing w:before="60" w:after="60"/>
-        <w:divId w:val="2038851442"/>
+        <w:divId w:val="609123552"/>
         <w:rPr>
           <w:rFonts w:ascii="微软雅黑" w:eastAsia="微软雅黑" w:hAnsi="微软雅黑" w:hint="eastAsia"/>
           <w:color w:val="333333"/>
@@ -2983,7 +2983,7 @@
         </w:numPr>
         <w:shd w:val="clear" w:color="auto" w:fill="FFFFFF"/>
         <w:spacing w:before="60" w:after="60"/>
-        <w:divId w:val="2038851442"/>
+        <w:divId w:val="609123552"/>
         <w:rPr>
           <w:rFonts w:ascii="微软雅黑" w:eastAsia="微软雅黑" w:hAnsi="微软雅黑" w:hint="eastAsia"/>
           <w:color w:val="333333"/>
@@ -3036,7 +3036,7 @@
         </w:numPr>
         <w:shd w:val="clear" w:color="auto" w:fill="FFFFFF"/>
         <w:spacing w:before="60" w:after="60"/>
-        <w:divId w:val="2038851442"/>
+        <w:divId w:val="609123552"/>
         <w:rPr>
           <w:rFonts w:ascii="微软雅黑" w:eastAsia="微软雅黑" w:hAnsi="微软雅黑" w:hint="eastAsia"/>
           <w:color w:val="333333"/>
@@ -3093,7 +3093,7 @@
     <w:p>
       <w:pPr>
         <w:shd w:val="clear" w:color="auto" w:fill="FFF8E1"/>
-        <w:divId w:val="1297953452"/>
+        <w:divId w:val="668754665"/>
         <w:rPr>
           <w:rFonts w:ascii="微软雅黑" w:eastAsia="微软雅黑" w:hAnsi="微软雅黑" w:hint="eastAsia"/>
           <w:color w:val="333333"/>
@@ -3115,7 +3115,7 @@
       <w:pPr>
         <w:pStyle w:val="2"/>
         <w:shd w:val="clear" w:color="auto" w:fill="FFFFFF"/>
-        <w:divId w:val="2038851442"/>
+        <w:divId w:val="609123552"/>
         <w:rPr>
           <w:rFonts w:ascii="微软雅黑" w:eastAsia="微软雅黑" w:hAnsi="微软雅黑" w:hint="eastAsia"/>
         </w:rPr>
@@ -3131,7 +3131,7 @@
       <w:pPr>
         <w:pStyle w:val="q"/>
         <w:shd w:val="clear" w:color="auto" w:fill="FFFFFF"/>
-        <w:divId w:val="2038851442"/>
+        <w:divId w:val="609123552"/>
         <w:rPr>
           <w:rFonts w:ascii="微软雅黑" w:eastAsia="微软雅黑" w:hAnsi="微软雅黑" w:hint="eastAsia"/>
         </w:rPr>
@@ -3153,7 +3153,7 @@
       <w:pPr>
         <w:pStyle w:val="a4"/>
         <w:shd w:val="clear" w:color="auto" w:fill="FFFFFF"/>
-        <w:divId w:val="2038851442"/>
+        <w:divId w:val="609123552"/>
         <w:rPr>
           <w:rFonts w:ascii="微软雅黑" w:eastAsia="微软雅黑" w:hAnsi="微软雅黑" w:hint="eastAsia"/>
         </w:rPr>
@@ -3193,7 +3193,7 @@
       <w:pPr>
         <w:pStyle w:val="q"/>
         <w:shd w:val="clear" w:color="auto" w:fill="FFFFFF"/>
-        <w:divId w:val="2038851442"/>
+        <w:divId w:val="609123552"/>
         <w:rPr>
           <w:rFonts w:ascii="微软雅黑" w:eastAsia="微软雅黑" w:hAnsi="微软雅黑" w:hint="eastAsia"/>
         </w:rPr>
@@ -3215,7 +3215,7 @@
       <w:pPr>
         <w:pStyle w:val="a4"/>
         <w:shd w:val="clear" w:color="auto" w:fill="FFFFFF"/>
-        <w:divId w:val="2038851442"/>
+        <w:divId w:val="609123552"/>
         <w:rPr>
           <w:rFonts w:ascii="微软雅黑" w:eastAsia="微软雅黑" w:hAnsi="微软雅黑" w:hint="eastAsia"/>
         </w:rPr>
@@ -3255,7 +3255,7 @@
       <w:pPr>
         <w:pStyle w:val="q"/>
         <w:shd w:val="clear" w:color="auto" w:fill="FFFFFF"/>
-        <w:divId w:val="2038851442"/>
+        <w:divId w:val="609123552"/>
         <w:rPr>
           <w:rFonts w:ascii="微软雅黑" w:eastAsia="微软雅黑" w:hAnsi="微软雅黑" w:hint="eastAsia"/>
         </w:rPr>
@@ -3277,7 +3277,7 @@
       <w:pPr>
         <w:pStyle w:val="a4"/>
         <w:shd w:val="clear" w:color="auto" w:fill="FFFFFF"/>
-        <w:divId w:val="2038851442"/>
+        <w:divId w:val="609123552"/>
         <w:rPr>
           <w:rFonts w:ascii="微软雅黑" w:eastAsia="微软雅黑" w:hAnsi="微软雅黑" w:hint="eastAsia"/>
         </w:rPr>
@@ -3317,7 +3317,7 @@
       <w:pPr>
         <w:pStyle w:val="q"/>
         <w:shd w:val="clear" w:color="auto" w:fill="FFFFFF"/>
-        <w:divId w:val="2038851442"/>
+        <w:divId w:val="609123552"/>
         <w:rPr>
           <w:rFonts w:ascii="微软雅黑" w:eastAsia="微软雅黑" w:hAnsi="微软雅黑" w:hint="eastAsia"/>
         </w:rPr>
@@ -3339,7 +3339,7 @@
       <w:pPr>
         <w:pStyle w:val="a4"/>
         <w:shd w:val="clear" w:color="auto" w:fill="FFFFFF"/>
-        <w:divId w:val="2038851442"/>
+        <w:divId w:val="609123552"/>
         <w:rPr>
           <w:rFonts w:ascii="微软雅黑" w:eastAsia="微软雅黑" w:hAnsi="微软雅黑" w:hint="eastAsia"/>
         </w:rPr>
@@ -3355,7 +3355,7 @@
       <w:pPr>
         <w:pStyle w:val="q"/>
         <w:shd w:val="clear" w:color="auto" w:fill="FFFFFF"/>
-        <w:divId w:val="2038851442"/>
+        <w:divId w:val="609123552"/>
         <w:rPr>
           <w:rFonts w:ascii="微软雅黑" w:eastAsia="微软雅黑" w:hAnsi="微软雅黑" w:hint="eastAsia"/>
         </w:rPr>
@@ -3377,7 +3377,7 @@
       <w:pPr>
         <w:pStyle w:val="a4"/>
         <w:shd w:val="clear" w:color="auto" w:fill="FFFFFF"/>
-        <w:divId w:val="2038851442"/>
+        <w:divId w:val="609123552"/>
         <w:rPr>
           <w:rFonts w:ascii="微软雅黑" w:eastAsia="微软雅黑" w:hAnsi="微软雅黑" w:hint="eastAsia"/>
         </w:rPr>
@@ -3423,7 +3423,7 @@
           <w:rStyle w:val="HTML"/>
           <w:rFonts w:hint="eastAsia"/>
         </w:rPr>
-        <w:t>https://1437238162-ho33k071it.ap-guangzhou.tencentscf.com</w:t>
+        <w:t>https://wl-123888.github.io/liuyanban/</w:t>
       </w:r>
       <w:r>
         <w:rPr>
@@ -3436,7 +3436,7 @@
       <w:pPr>
         <w:pStyle w:val="q"/>
         <w:shd w:val="clear" w:color="auto" w:fill="FFFFFF"/>
-        <w:divId w:val="2038851442"/>
+        <w:divId w:val="609123552"/>
         <w:rPr>
           <w:rFonts w:ascii="微软雅黑" w:eastAsia="微软雅黑" w:hAnsi="微软雅黑" w:hint="eastAsia"/>
         </w:rPr>
@@ -3458,7 +3458,7 @@
       <w:pPr>
         <w:pStyle w:val="a4"/>
         <w:shd w:val="clear" w:color="auto" w:fill="FFFFFF"/>
-        <w:divId w:val="2038851442"/>
+        <w:divId w:val="609123552"/>
         <w:rPr>
           <w:rFonts w:ascii="微软雅黑" w:eastAsia="微软雅黑" w:hAnsi="微软雅黑" w:hint="eastAsia"/>
         </w:rPr>
@@ -3486,7 +3486,7 @@
       <w:pPr>
         <w:pStyle w:val="q"/>
         <w:shd w:val="clear" w:color="auto" w:fill="FFFFFF"/>
-        <w:divId w:val="2038851442"/>
+        <w:divId w:val="609123552"/>
         <w:rPr>
           <w:rFonts w:ascii="微软雅黑" w:eastAsia="微软雅黑" w:hAnsi="微软雅黑" w:hint="eastAsia"/>
         </w:rPr>
@@ -3508,7 +3508,7 @@
       <w:pPr>
         <w:pStyle w:val="a4"/>
         <w:shd w:val="clear" w:color="auto" w:fill="FFFFFF"/>
-        <w:divId w:val="2038851442"/>
+        <w:divId w:val="609123552"/>
         <w:rPr>
           <w:rFonts w:ascii="微软雅黑" w:eastAsia="微软雅黑" w:hAnsi="微软雅黑" w:hint="eastAsia"/>
         </w:rPr>
@@ -3623,9 +3623,122 @@
 <file path=word/numbering.xml><?xml version="1.0" encoding="utf-8"?>
 <w:numbering xmlns:wpc="http://schemas.microsoft.com/office/word/2010/wordprocessingCanvas" xmlns:cx="http://schemas.microsoft.com/office/drawing/2014/chartex" xmlns:cx1="http://schemas.microsoft.com/office/drawing/2015/9/8/chartex" xmlns:cx2="http://schemas.microsoft.com/office/drawing/2015/10/21/chartex" xmlns:cx3="http://schemas.microsoft.com/office/drawing/2016/5/9/chartex" xmlns:cx4="http://schemas.microsoft.com/office/drawing/2016/5/10/chartex" xmlns:cx5="http://schemas.microsoft.com/office/drawing/2016/5/11/chartex" xmlns:cx6="http://schemas.microsoft.com/office/drawing/2016/5/12/chartex" xmlns:cx7="http://schemas.microsoft.com/office/drawing/2016/5/13/chartex" xmlns:cx8="http://schemas.microsoft.com/office/drawing/2016/5/14/chartex" xmlns:mc="http://schemas.openxmlformats.org/markup-compatibility/2006" xmlns:aink="http://schemas.microsoft.com/office/drawing/2016/ink" xmlns:am3d="http://schemas.microsoft.com/office/drawing/2017/model3d" xmlns:o="urn:schemas-microsoft-com:office:office" xmlns:oel="http://schemas.microsoft.com/office/2019/extlst" xmlns:r="http://schemas.openxmlformats.org/officeDocument/2006/relationships" xmlns:m="http://schemas.openxmlformats.org/officeDocument/2006/math" xmlns:v="urn:schemas-microsoft-com:vml" xmlns:wp14="http://schemas.microsoft.com/office/word/2010/wordprocessingDrawing" xmlns:wp="http://schemas.openxmlformats.org/drawingml/2006/wordprocessingDrawing" xmlns:w10="urn:schemas-microsoft-com:office:word" xmlns:w="http://schemas.openxmlformats.org/wordprocessingml/2006/main" xmlns:w14="http://schemas.microsoft.com/office/word/2010/wordml" xmlns:w15="http://schemas.microsoft.com/office/word/2012/wordml" xmlns:w16cex="http://schemas.microsoft.com/office/word/2018/wordml/cex" xmlns:w16cid="http://schemas.microsoft.com/office/word/2016/wordml/cid" xmlns:w16="http://schemas.microsoft.com/office/word/2018/wordml" xmlns:w16du="http://schemas.microsoft.com/office/word/2023/wordml/word16du" xmlns:w16sdtdh="http://schemas.microsoft.com/office/word/2020/wordml/sdtdatahash" xmlns:w16sdtfl="http://schemas.microsoft.com/office/word/2024/wordml/sdtformatlock" xmlns:w16se="http://schemas.microsoft.com/office/word/2015/wordml/symex" xmlns:wpg="http://schemas.microsoft.com/office/word/2010/wordprocessingGroup" xmlns:wpi="http://schemas.microsoft.com/office/word/2010/wordprocessingInk" xmlns:wne="http://schemas.microsoft.com/office/word/2006/wordml" xmlns:wps="http://schemas.microsoft.com/office/word/2010/wordprocessingShape" mc:Ignorable="w14 w15 w16se w16cid w16 w16cex w16sdtdh w16sdtfl w16du wp14">
   <w:abstractNum w:abstractNumId="0" w15:restartNumberingAfterBreak="0">
-    <w:nsid w:val="14CB6F56"/>
+    <w:nsid w:val="05B06139"/>
     <w:multiLevelType w:val="multilevel"/>
-    <w:tmpl w:val="F6E6925C"/>
+    <w:tmpl w:val="24E497F8"/>
+    <w:lvl w:ilvl="0">
+      <w:start w:val="1"/>
+      <w:numFmt w:val="decimal"/>
+      <w:lvlText w:val="%1."/>
+      <w:lvlJc w:val="left"/>
+      <w:pPr>
+        <w:tabs>
+          <w:tab w:val="num" w:pos="720"/>
+        </w:tabs>
+        <w:ind w:left="720" w:hanging="360"/>
+      </w:pPr>
+    </w:lvl>
+    <w:lvl w:ilvl="1" w:tentative="1">
+      <w:start w:val="1"/>
+      <w:numFmt w:val="decimal"/>
+      <w:lvlText w:val="%2."/>
+      <w:lvlJc w:val="left"/>
+      <w:pPr>
+        <w:tabs>
+          <w:tab w:val="num" w:pos="1440"/>
+        </w:tabs>
+        <w:ind w:left="1440" w:hanging="360"/>
+      </w:pPr>
+    </w:lvl>
+    <w:lvl w:ilvl="2" w:tentative="1">
+      <w:start w:val="1"/>
+      <w:numFmt w:val="decimal"/>
+      <w:lvlText w:val="%3."/>
+      <w:lvlJc w:val="left"/>
+      <w:pPr>
+        <w:tabs>
+          <w:tab w:val="num" w:pos="2160"/>
+        </w:tabs>
+        <w:ind w:left="2160" w:hanging="360"/>
+      </w:pPr>
+    </w:lvl>
+    <w:lvl w:ilvl="3" w:tentative="1">
+      <w:start w:val="1"/>
+      <w:numFmt w:val="decimal"/>
+      <w:lvlText w:val="%4."/>
+      <w:lvlJc w:val="left"/>
+      <w:pPr>
+        <w:tabs>
+          <w:tab w:val="num" w:pos="2880"/>
+        </w:tabs>
+        <w:ind w:left="2880" w:hanging="360"/>
+      </w:pPr>
+    </w:lvl>
+    <w:lvl w:ilvl="4" w:tentative="1">
+      <w:start w:val="1"/>
+      <w:numFmt w:val="decimal"/>
+      <w:lvlText w:val="%5."/>
+      <w:lvlJc w:val="left"/>
+      <w:pPr>
+        <w:tabs>
+          <w:tab w:val="num" w:pos="3600"/>
+        </w:tabs>
+        <w:ind w:left="3600" w:hanging="360"/>
+      </w:pPr>
+    </w:lvl>
+    <w:lvl w:ilvl="5" w:tentative="1">
+      <w:start w:val="1"/>
+      <w:numFmt w:val="decimal"/>
+      <w:lvlText w:val="%6."/>
+      <w:lvlJc w:val="left"/>
+      <w:pPr>
+        <w:tabs>
+          <w:tab w:val="num" w:pos="4320"/>
+        </w:tabs>
+        <w:ind w:left="4320" w:hanging="360"/>
+      </w:pPr>
+    </w:lvl>
+    <w:lvl w:ilvl="6" w:tentative="1">
+      <w:start w:val="1"/>
+      <w:numFmt w:val="decimal"/>
+      <w:lvlText w:val="%7."/>
+      <w:lvlJc w:val="left"/>
+      <w:pPr>
+        <w:tabs>
+          <w:tab w:val="num" w:pos="5040"/>
+        </w:tabs>
+        <w:ind w:left="5040" w:hanging="360"/>
+      </w:pPr>
+    </w:lvl>
+    <w:lvl w:ilvl="7" w:tentative="1">
+      <w:start w:val="1"/>
+      <w:numFmt w:val="decimal"/>
+      <w:lvlText w:val="%8."/>
+      <w:lvlJc w:val="left"/>
+      <w:pPr>
+        <w:tabs>
+          <w:tab w:val="num" w:pos="5760"/>
+        </w:tabs>
+        <w:ind w:left="5760" w:hanging="360"/>
+      </w:pPr>
+    </w:lvl>
+    <w:lvl w:ilvl="8" w:tentative="1">
+      <w:start w:val="1"/>
+      <w:numFmt w:val="decimal"/>
+      <w:lvlText w:val="%9."/>
+      <w:lvlJc w:val="left"/>
+      <w:pPr>
+        <w:tabs>
+          <w:tab w:val="num" w:pos="6480"/>
+        </w:tabs>
+        <w:ind w:left="6480" w:hanging="360"/>
+      </w:pPr>
+    </w:lvl>
+  </w:abstractNum>
+  <w:abstractNum w:abstractNumId="1" w15:restartNumberingAfterBreak="0">
+    <w:nsid w:val="09123782"/>
+    <w:multiLevelType w:val="multilevel"/>
+    <w:tmpl w:val="8A3A4E22"/>
     <w:lvl w:ilvl="0">
       <w:start w:val="1"/>
       <w:numFmt w:val="bullet"/>
@@ -3771,10 +3884,10 @@
       </w:rPr>
     </w:lvl>
   </w:abstractNum>
-  <w:abstractNum w:abstractNumId="1" w15:restartNumberingAfterBreak="0">
-    <w:nsid w:val="19E51009"/>
+  <w:abstractNum w:abstractNumId="2" w15:restartNumberingAfterBreak="0">
+    <w:nsid w:val="0EA46A04"/>
     <w:multiLevelType w:val="multilevel"/>
-    <w:tmpl w:val="CD04A6F2"/>
+    <w:tmpl w:val="E9EC8982"/>
     <w:lvl w:ilvl="0">
       <w:start w:val="1"/>
       <w:numFmt w:val="decimal"/>
@@ -3884,10 +3997,236 @@
       </w:pPr>
     </w:lvl>
   </w:abstractNum>
-  <w:abstractNum w:abstractNumId="2" w15:restartNumberingAfterBreak="0">
-    <w:nsid w:val="37543E76"/>
+  <w:abstractNum w:abstractNumId="3" w15:restartNumberingAfterBreak="0">
+    <w:nsid w:val="26BA6A0E"/>
     <w:multiLevelType w:val="multilevel"/>
-    <w:tmpl w:val="F5F66266"/>
+    <w:tmpl w:val="F74CE00E"/>
+    <w:lvl w:ilvl="0">
+      <w:start w:val="1"/>
+      <w:numFmt w:val="decimal"/>
+      <w:lvlText w:val="%1."/>
+      <w:lvlJc w:val="left"/>
+      <w:pPr>
+        <w:tabs>
+          <w:tab w:val="num" w:pos="720"/>
+        </w:tabs>
+        <w:ind w:left="720" w:hanging="360"/>
+      </w:pPr>
+    </w:lvl>
+    <w:lvl w:ilvl="1" w:tentative="1">
+      <w:start w:val="1"/>
+      <w:numFmt w:val="decimal"/>
+      <w:lvlText w:val="%2."/>
+      <w:lvlJc w:val="left"/>
+      <w:pPr>
+        <w:tabs>
+          <w:tab w:val="num" w:pos="1440"/>
+        </w:tabs>
+        <w:ind w:left="1440" w:hanging="360"/>
+      </w:pPr>
+    </w:lvl>
+    <w:lvl w:ilvl="2" w:tentative="1">
+      <w:start w:val="1"/>
+      <w:numFmt w:val="decimal"/>
+      <w:lvlText w:val="%3."/>
+      <w:lvlJc w:val="left"/>
+      <w:pPr>
+        <w:tabs>
+          <w:tab w:val="num" w:pos="2160"/>
+        </w:tabs>
+        <w:ind w:left="2160" w:hanging="360"/>
+      </w:pPr>
+    </w:lvl>
+    <w:lvl w:ilvl="3" w:tentative="1">
+      <w:start w:val="1"/>
+      <w:numFmt w:val="decimal"/>
+      <w:lvlText w:val="%4."/>
+      <w:lvlJc w:val="left"/>
+      <w:pPr>
+        <w:tabs>
+          <w:tab w:val="num" w:pos="2880"/>
+        </w:tabs>
+        <w:ind w:left="2880" w:hanging="360"/>
+      </w:pPr>
+    </w:lvl>
+    <w:lvl w:ilvl="4" w:tentative="1">
+      <w:start w:val="1"/>
+      <w:numFmt w:val="decimal"/>
+      <w:lvlText w:val="%5."/>
+      <w:lvlJc w:val="left"/>
+      <w:pPr>
+        <w:tabs>
+          <w:tab w:val="num" w:pos="3600"/>
+        </w:tabs>
+        <w:ind w:left="3600" w:hanging="360"/>
+      </w:pPr>
+    </w:lvl>
+    <w:lvl w:ilvl="5" w:tentative="1">
+      <w:start w:val="1"/>
+      <w:numFmt w:val="decimal"/>
+      <w:lvlText w:val="%6."/>
+      <w:lvlJc w:val="left"/>
+      <w:pPr>
+        <w:tabs>
+          <w:tab w:val="num" w:pos="4320"/>
+        </w:tabs>
+        <w:ind w:left="4320" w:hanging="360"/>
+      </w:pPr>
+    </w:lvl>
+    <w:lvl w:ilvl="6" w:tentative="1">
+      <w:start w:val="1"/>
+      <w:numFmt w:val="decimal"/>
+      <w:lvlText w:val="%7."/>
+      <w:lvlJc w:val="left"/>
+      <w:pPr>
+        <w:tabs>
+          <w:tab w:val="num" w:pos="5040"/>
+        </w:tabs>
+        <w:ind w:left="5040" w:hanging="360"/>
+      </w:pPr>
+    </w:lvl>
+    <w:lvl w:ilvl="7" w:tentative="1">
+      <w:start w:val="1"/>
+      <w:numFmt w:val="decimal"/>
+      <w:lvlText w:val="%8."/>
+      <w:lvlJc w:val="left"/>
+      <w:pPr>
+        <w:tabs>
+          <w:tab w:val="num" w:pos="5760"/>
+        </w:tabs>
+        <w:ind w:left="5760" w:hanging="360"/>
+      </w:pPr>
+    </w:lvl>
+    <w:lvl w:ilvl="8" w:tentative="1">
+      <w:start w:val="1"/>
+      <w:numFmt w:val="decimal"/>
+      <w:lvlText w:val="%9."/>
+      <w:lvlJc w:val="left"/>
+      <w:pPr>
+        <w:tabs>
+          <w:tab w:val="num" w:pos="6480"/>
+        </w:tabs>
+        <w:ind w:left="6480" w:hanging="360"/>
+      </w:pPr>
+    </w:lvl>
+  </w:abstractNum>
+  <w:abstractNum w:abstractNumId="4" w15:restartNumberingAfterBreak="0">
+    <w:nsid w:val="279A74D6"/>
+    <w:multiLevelType w:val="multilevel"/>
+    <w:tmpl w:val="FEB87E7A"/>
+    <w:lvl w:ilvl="0">
+      <w:start w:val="1"/>
+      <w:numFmt w:val="decimal"/>
+      <w:lvlText w:val="%1."/>
+      <w:lvlJc w:val="left"/>
+      <w:pPr>
+        <w:tabs>
+          <w:tab w:val="num" w:pos="720"/>
+        </w:tabs>
+        <w:ind w:left="720" w:hanging="360"/>
+      </w:pPr>
+    </w:lvl>
+    <w:lvl w:ilvl="1" w:tentative="1">
+      <w:start w:val="1"/>
+      <w:numFmt w:val="decimal"/>
+      <w:lvlText w:val="%2."/>
+      <w:lvlJc w:val="left"/>
+      <w:pPr>
+        <w:tabs>
+          <w:tab w:val="num" w:pos="1440"/>
+        </w:tabs>
+        <w:ind w:left="1440" w:hanging="360"/>
+      </w:pPr>
+    </w:lvl>
+    <w:lvl w:ilvl="2" w:tentative="1">
+      <w:start w:val="1"/>
+      <w:numFmt w:val="decimal"/>
+      <w:lvlText w:val="%3."/>
+      <w:lvlJc w:val="left"/>
+      <w:pPr>
+        <w:tabs>
+          <w:tab w:val="num" w:pos="2160"/>
+        </w:tabs>
+        <w:ind w:left="2160" w:hanging="360"/>
+      </w:pPr>
+    </w:lvl>
+    <w:lvl w:ilvl="3" w:tentative="1">
+      <w:start w:val="1"/>
+      <w:numFmt w:val="decimal"/>
+      <w:lvlText w:val="%4."/>
+      <w:lvlJc w:val="left"/>
+      <w:pPr>
+        <w:tabs>
+          <w:tab w:val="num" w:pos="2880"/>
+        </w:tabs>
+        <w:ind w:left="2880" w:hanging="360"/>
+      </w:pPr>
+    </w:lvl>
+    <w:lvl w:ilvl="4" w:tentative="1">
+      <w:start w:val="1"/>
+      <w:numFmt w:val="decimal"/>
+      <w:lvlText w:val="%5."/>
+      <w:lvlJc w:val="left"/>
+      <w:pPr>
+        <w:tabs>
+          <w:tab w:val="num" w:pos="3600"/>
+        </w:tabs>
+        <w:ind w:left="3600" w:hanging="360"/>
+      </w:pPr>
+    </w:lvl>
+    <w:lvl w:ilvl="5" w:tentative="1">
+      <w:start w:val="1"/>
+      <w:numFmt w:val="decimal"/>
+      <w:lvlText w:val="%6."/>
+      <w:lvlJc w:val="left"/>
+      <w:pPr>
+        <w:tabs>
+          <w:tab w:val="num" w:pos="4320"/>
+        </w:tabs>
+        <w:ind w:left="4320" w:hanging="360"/>
+      </w:pPr>
+    </w:lvl>
+    <w:lvl w:ilvl="6" w:tentative="1">
+      <w:start w:val="1"/>
+      <w:numFmt w:val="decimal"/>
+      <w:lvlText w:val="%7."/>
+      <w:lvlJc w:val="left"/>
+      <w:pPr>
+        <w:tabs>
+          <w:tab w:val="num" w:pos="5040"/>
+        </w:tabs>
+        <w:ind w:left="5040" w:hanging="360"/>
+      </w:pPr>
+    </w:lvl>
+    <w:lvl w:ilvl="7" w:tentative="1">
+      <w:start w:val="1"/>
+      <w:numFmt w:val="decimal"/>
+      <w:lvlText w:val="%8."/>
+      <w:lvlJc w:val="left"/>
+      <w:pPr>
+        <w:tabs>
+          <w:tab w:val="num" w:pos="5760"/>
+        </w:tabs>
+        <w:ind w:left="5760" w:hanging="360"/>
+      </w:pPr>
+    </w:lvl>
+    <w:lvl w:ilvl="8" w:tentative="1">
+      <w:start w:val="1"/>
+      <w:numFmt w:val="decimal"/>
+      <w:lvlText w:val="%9."/>
+      <w:lvlJc w:val="left"/>
+      <w:pPr>
+        <w:tabs>
+          <w:tab w:val="num" w:pos="6480"/>
+        </w:tabs>
+        <w:ind w:left="6480" w:hanging="360"/>
+      </w:pPr>
+    </w:lvl>
+  </w:abstractNum>
+  <w:abstractNum w:abstractNumId="5" w15:restartNumberingAfterBreak="0">
+    <w:nsid w:val="352468EC"/>
+    <w:multiLevelType w:val="multilevel"/>
+    <w:tmpl w:val="FBA2280A"/>
     <w:lvl w:ilvl="0">
       <w:start w:val="1"/>
       <w:numFmt w:val="bullet"/>
@@ -4033,123 +4372,10 @@
       </w:rPr>
     </w:lvl>
   </w:abstractNum>
-  <w:abstractNum w:abstractNumId="3" w15:restartNumberingAfterBreak="0">
-    <w:nsid w:val="390F301B"/>
+  <w:abstractNum w:abstractNumId="6" w15:restartNumberingAfterBreak="0">
+    <w:nsid w:val="42EE5F37"/>
     <w:multiLevelType w:val="multilevel"/>
-    <w:tmpl w:val="8C0626F6"/>
-    <w:lvl w:ilvl="0">
-      <w:start w:val="1"/>
-      <w:numFmt w:val="decimal"/>
-      <w:lvlText w:val="%1."/>
-      <w:lvlJc w:val="left"/>
-      <w:pPr>
-        <w:tabs>
-          <w:tab w:val="num" w:pos="720"/>
-        </w:tabs>
-        <w:ind w:left="720" w:hanging="360"/>
-      </w:pPr>
-    </w:lvl>
-    <w:lvl w:ilvl="1" w:tentative="1">
-      <w:start w:val="1"/>
-      <w:numFmt w:val="decimal"/>
-      <w:lvlText w:val="%2."/>
-      <w:lvlJc w:val="left"/>
-      <w:pPr>
-        <w:tabs>
-          <w:tab w:val="num" w:pos="1440"/>
-        </w:tabs>
-        <w:ind w:left="1440" w:hanging="360"/>
-      </w:pPr>
-    </w:lvl>
-    <w:lvl w:ilvl="2" w:tentative="1">
-      <w:start w:val="1"/>
-      <w:numFmt w:val="decimal"/>
-      <w:lvlText w:val="%3."/>
-      <w:lvlJc w:val="left"/>
-      <w:pPr>
-        <w:tabs>
-          <w:tab w:val="num" w:pos="2160"/>
-        </w:tabs>
-        <w:ind w:left="2160" w:hanging="360"/>
-      </w:pPr>
-    </w:lvl>
-    <w:lvl w:ilvl="3" w:tentative="1">
-      <w:start w:val="1"/>
-      <w:numFmt w:val="decimal"/>
-      <w:lvlText w:val="%4."/>
-      <w:lvlJc w:val="left"/>
-      <w:pPr>
-        <w:tabs>
-          <w:tab w:val="num" w:pos="2880"/>
-        </w:tabs>
-        <w:ind w:left="2880" w:hanging="360"/>
-      </w:pPr>
-    </w:lvl>
-    <w:lvl w:ilvl="4" w:tentative="1">
-      <w:start w:val="1"/>
-      <w:numFmt w:val="decimal"/>
-      <w:lvlText w:val="%5."/>
-      <w:lvlJc w:val="left"/>
-      <w:pPr>
-        <w:tabs>
-          <w:tab w:val="num" w:pos="3600"/>
-        </w:tabs>
-        <w:ind w:left="3600" w:hanging="360"/>
-      </w:pPr>
-    </w:lvl>
-    <w:lvl w:ilvl="5" w:tentative="1">
-      <w:start w:val="1"/>
-      <w:numFmt w:val="decimal"/>
-      <w:lvlText w:val="%6."/>
-      <w:lvlJc w:val="left"/>
-      <w:pPr>
-        <w:tabs>
-          <w:tab w:val="num" w:pos="4320"/>
-        </w:tabs>
-        <w:ind w:left="4320" w:hanging="360"/>
-      </w:pPr>
-    </w:lvl>
-    <w:lvl w:ilvl="6" w:tentative="1">
-      <w:start w:val="1"/>
-      <w:numFmt w:val="decimal"/>
-      <w:lvlText w:val="%7."/>
-      <w:lvlJc w:val="left"/>
-      <w:pPr>
-        <w:tabs>
-          <w:tab w:val="num" w:pos="5040"/>
-        </w:tabs>
-        <w:ind w:left="5040" w:hanging="360"/>
-      </w:pPr>
-    </w:lvl>
-    <w:lvl w:ilvl="7" w:tentative="1">
-      <w:start w:val="1"/>
-      <w:numFmt w:val="decimal"/>
-      <w:lvlText w:val="%8."/>
-      <w:lvlJc w:val="left"/>
-      <w:pPr>
-        <w:tabs>
-          <w:tab w:val="num" w:pos="5760"/>
-        </w:tabs>
-        <w:ind w:left="5760" w:hanging="360"/>
-      </w:pPr>
-    </w:lvl>
-    <w:lvl w:ilvl="8" w:tentative="1">
-      <w:start w:val="1"/>
-      <w:numFmt w:val="decimal"/>
-      <w:lvlText w:val="%9."/>
-      <w:lvlJc w:val="left"/>
-      <w:pPr>
-        <w:tabs>
-          <w:tab w:val="num" w:pos="6480"/>
-        </w:tabs>
-        <w:ind w:left="6480" w:hanging="360"/>
-      </w:pPr>
-    </w:lvl>
-  </w:abstractNum>
-  <w:abstractNum w:abstractNumId="4" w15:restartNumberingAfterBreak="0">
-    <w:nsid w:val="503E1D70"/>
-    <w:multiLevelType w:val="multilevel"/>
-    <w:tmpl w:val="FC249E26"/>
+    <w:tmpl w:val="0180D74C"/>
     <w:lvl w:ilvl="0">
       <w:start w:val="1"/>
       <w:numFmt w:val="bullet"/>
@@ -4295,10 +4521,10 @@
       </w:rPr>
     </w:lvl>
   </w:abstractNum>
-  <w:abstractNum w:abstractNumId="5" w15:restartNumberingAfterBreak="0">
-    <w:nsid w:val="50947931"/>
+  <w:abstractNum w:abstractNumId="7" w15:restartNumberingAfterBreak="0">
+    <w:nsid w:val="49B43737"/>
     <w:multiLevelType w:val="multilevel"/>
-    <w:tmpl w:val="4D2AB33A"/>
+    <w:tmpl w:val="014072DC"/>
     <w:lvl w:ilvl="0">
       <w:start w:val="1"/>
       <w:numFmt w:val="decimal"/>
@@ -4408,10 +4634,10 @@
       </w:pPr>
     </w:lvl>
   </w:abstractNum>
-  <w:abstractNum w:abstractNumId="6" w15:restartNumberingAfterBreak="0">
-    <w:nsid w:val="6BF720CE"/>
+  <w:abstractNum w:abstractNumId="8" w15:restartNumberingAfterBreak="0">
+    <w:nsid w:val="6BE75599"/>
     <w:multiLevelType w:val="multilevel"/>
-    <w:tmpl w:val="8ABE0B3A"/>
+    <w:tmpl w:val="9AE6FB64"/>
     <w:lvl w:ilvl="0">
       <w:start w:val="1"/>
       <w:numFmt w:val="decimal"/>
@@ -4521,258 +4747,32 @@
       </w:pPr>
     </w:lvl>
   </w:abstractNum>
-  <w:abstractNum w:abstractNumId="7" w15:restartNumberingAfterBreak="0">
-    <w:nsid w:val="6E0B7313"/>
-    <w:multiLevelType w:val="multilevel"/>
-    <w:tmpl w:val="E8D6EF00"/>
-    <w:lvl w:ilvl="0">
-      <w:start w:val="1"/>
-      <w:numFmt w:val="decimal"/>
-      <w:lvlText w:val="%1."/>
-      <w:lvlJc w:val="left"/>
-      <w:pPr>
-        <w:tabs>
-          <w:tab w:val="num" w:pos="720"/>
-        </w:tabs>
-        <w:ind w:left="720" w:hanging="360"/>
-      </w:pPr>
-    </w:lvl>
-    <w:lvl w:ilvl="1" w:tentative="1">
-      <w:start w:val="1"/>
-      <w:numFmt w:val="decimal"/>
-      <w:lvlText w:val="%2."/>
-      <w:lvlJc w:val="left"/>
-      <w:pPr>
-        <w:tabs>
-          <w:tab w:val="num" w:pos="1440"/>
-        </w:tabs>
-        <w:ind w:left="1440" w:hanging="360"/>
-      </w:pPr>
-    </w:lvl>
-    <w:lvl w:ilvl="2" w:tentative="1">
-      <w:start w:val="1"/>
-      <w:numFmt w:val="decimal"/>
-      <w:lvlText w:val="%3."/>
-      <w:lvlJc w:val="left"/>
-      <w:pPr>
-        <w:tabs>
-          <w:tab w:val="num" w:pos="2160"/>
-        </w:tabs>
-        <w:ind w:left="2160" w:hanging="360"/>
-      </w:pPr>
-    </w:lvl>
-    <w:lvl w:ilvl="3" w:tentative="1">
-      <w:start w:val="1"/>
-      <w:numFmt w:val="decimal"/>
-      <w:lvlText w:val="%4."/>
-      <w:lvlJc w:val="left"/>
-      <w:pPr>
-        <w:tabs>
-          <w:tab w:val="num" w:pos="2880"/>
-        </w:tabs>
-        <w:ind w:left="2880" w:hanging="360"/>
-      </w:pPr>
-    </w:lvl>
-    <w:lvl w:ilvl="4" w:tentative="1">
-      <w:start w:val="1"/>
-      <w:numFmt w:val="decimal"/>
-      <w:lvlText w:val="%5."/>
-      <w:lvlJc w:val="left"/>
-      <w:pPr>
-        <w:tabs>
-          <w:tab w:val="num" w:pos="3600"/>
-        </w:tabs>
-        <w:ind w:left="3600" w:hanging="360"/>
-      </w:pPr>
-    </w:lvl>
-    <w:lvl w:ilvl="5" w:tentative="1">
-      <w:start w:val="1"/>
-      <w:numFmt w:val="decimal"/>
-      <w:lvlText w:val="%6."/>
-      <w:lvlJc w:val="left"/>
-      <w:pPr>
-        <w:tabs>
-          <w:tab w:val="num" w:pos="4320"/>
-        </w:tabs>
-        <w:ind w:left="4320" w:hanging="360"/>
-      </w:pPr>
-    </w:lvl>
-    <w:lvl w:ilvl="6" w:tentative="1">
-      <w:start w:val="1"/>
-      <w:numFmt w:val="decimal"/>
-      <w:lvlText w:val="%7."/>
-      <w:lvlJc w:val="left"/>
-      <w:pPr>
-        <w:tabs>
-          <w:tab w:val="num" w:pos="5040"/>
-        </w:tabs>
-        <w:ind w:left="5040" w:hanging="360"/>
-      </w:pPr>
-    </w:lvl>
-    <w:lvl w:ilvl="7" w:tentative="1">
-      <w:start w:val="1"/>
-      <w:numFmt w:val="decimal"/>
-      <w:lvlText w:val="%8."/>
-      <w:lvlJc w:val="left"/>
-      <w:pPr>
-        <w:tabs>
-          <w:tab w:val="num" w:pos="5760"/>
-        </w:tabs>
-        <w:ind w:left="5760" w:hanging="360"/>
-      </w:pPr>
-    </w:lvl>
-    <w:lvl w:ilvl="8" w:tentative="1">
-      <w:start w:val="1"/>
-      <w:numFmt w:val="decimal"/>
-      <w:lvlText w:val="%9."/>
-      <w:lvlJc w:val="left"/>
-      <w:pPr>
-        <w:tabs>
-          <w:tab w:val="num" w:pos="6480"/>
-        </w:tabs>
-        <w:ind w:left="6480" w:hanging="360"/>
-      </w:pPr>
-    </w:lvl>
-  </w:abstractNum>
-  <w:abstractNum w:abstractNumId="8" w15:restartNumberingAfterBreak="0">
-    <w:nsid w:val="76C779F4"/>
-    <w:multiLevelType w:val="multilevel"/>
-    <w:tmpl w:val="D24655EE"/>
-    <w:lvl w:ilvl="0">
-      <w:start w:val="1"/>
-      <w:numFmt w:val="decimal"/>
-      <w:lvlText w:val="%1."/>
-      <w:lvlJc w:val="left"/>
-      <w:pPr>
-        <w:tabs>
-          <w:tab w:val="num" w:pos="720"/>
-        </w:tabs>
-        <w:ind w:left="720" w:hanging="360"/>
-      </w:pPr>
-    </w:lvl>
-    <w:lvl w:ilvl="1" w:tentative="1">
-      <w:start w:val="1"/>
-      <w:numFmt w:val="decimal"/>
-      <w:lvlText w:val="%2."/>
-      <w:lvlJc w:val="left"/>
-      <w:pPr>
-        <w:tabs>
-          <w:tab w:val="num" w:pos="1440"/>
-        </w:tabs>
-        <w:ind w:left="1440" w:hanging="360"/>
-      </w:pPr>
-    </w:lvl>
-    <w:lvl w:ilvl="2" w:tentative="1">
-      <w:start w:val="1"/>
-      <w:numFmt w:val="decimal"/>
-      <w:lvlText w:val="%3."/>
-      <w:lvlJc w:val="left"/>
-      <w:pPr>
-        <w:tabs>
-          <w:tab w:val="num" w:pos="2160"/>
-        </w:tabs>
-        <w:ind w:left="2160" w:hanging="360"/>
-      </w:pPr>
-    </w:lvl>
-    <w:lvl w:ilvl="3" w:tentative="1">
-      <w:start w:val="1"/>
-      <w:numFmt w:val="decimal"/>
-      <w:lvlText w:val="%4."/>
-      <w:lvlJc w:val="left"/>
-      <w:pPr>
-        <w:tabs>
-          <w:tab w:val="num" w:pos="2880"/>
-        </w:tabs>
-        <w:ind w:left="2880" w:hanging="360"/>
-      </w:pPr>
-    </w:lvl>
-    <w:lvl w:ilvl="4" w:tentative="1">
-      <w:start w:val="1"/>
-      <w:numFmt w:val="decimal"/>
-      <w:lvlText w:val="%5."/>
-      <w:lvlJc w:val="left"/>
-      <w:pPr>
-        <w:tabs>
-          <w:tab w:val="num" w:pos="3600"/>
-        </w:tabs>
-        <w:ind w:left="3600" w:hanging="360"/>
-      </w:pPr>
-    </w:lvl>
-    <w:lvl w:ilvl="5" w:tentative="1">
-      <w:start w:val="1"/>
-      <w:numFmt w:val="decimal"/>
-      <w:lvlText w:val="%6."/>
-      <w:lvlJc w:val="left"/>
-      <w:pPr>
-        <w:tabs>
-          <w:tab w:val="num" w:pos="4320"/>
-        </w:tabs>
-        <w:ind w:left="4320" w:hanging="360"/>
-      </w:pPr>
-    </w:lvl>
-    <w:lvl w:ilvl="6" w:tentative="1">
-      <w:start w:val="1"/>
-      <w:numFmt w:val="decimal"/>
-      <w:lvlText w:val="%7."/>
-      <w:lvlJc w:val="left"/>
-      <w:pPr>
-        <w:tabs>
-          <w:tab w:val="num" w:pos="5040"/>
-        </w:tabs>
-        <w:ind w:left="5040" w:hanging="360"/>
-      </w:pPr>
-    </w:lvl>
-    <w:lvl w:ilvl="7" w:tentative="1">
-      <w:start w:val="1"/>
-      <w:numFmt w:val="decimal"/>
-      <w:lvlText w:val="%8."/>
-      <w:lvlJc w:val="left"/>
-      <w:pPr>
-        <w:tabs>
-          <w:tab w:val="num" w:pos="5760"/>
-        </w:tabs>
-        <w:ind w:left="5760" w:hanging="360"/>
-      </w:pPr>
-    </w:lvl>
-    <w:lvl w:ilvl="8" w:tentative="1">
-      <w:start w:val="1"/>
-      <w:numFmt w:val="decimal"/>
-      <w:lvlText w:val="%9."/>
-      <w:lvlJc w:val="left"/>
-      <w:pPr>
-        <w:tabs>
-          <w:tab w:val="num" w:pos="6480"/>
-        </w:tabs>
-        <w:ind w:left="6480" w:hanging="360"/>
-      </w:pPr>
-    </w:lvl>
-  </w:abstractNum>
-  <w:num w:numId="1" w16cid:durableId="1155417944">
+  <w:num w:numId="1" w16cid:durableId="1906527261">
+    <w:abstractNumId w:val="8"/>
+  </w:num>
+  <w:num w:numId="2" w16cid:durableId="378480072">
+    <w:abstractNumId w:val="3"/>
+  </w:num>
+  <w:num w:numId="3" w16cid:durableId="1467621678">
+    <w:abstractNumId w:val="4"/>
+  </w:num>
+  <w:num w:numId="4" w16cid:durableId="2091074432">
+    <w:abstractNumId w:val="6"/>
+  </w:num>
+  <w:num w:numId="5" w16cid:durableId="1931084203">
     <w:abstractNumId w:val="7"/>
   </w:num>
-  <w:num w:numId="2" w16cid:durableId="622924298">
+  <w:num w:numId="6" w16cid:durableId="1158574511">
     <w:abstractNumId w:val="5"/>
   </w:num>
-  <w:num w:numId="3" w16cid:durableId="193271103">
-    <w:abstractNumId w:val="3"/>
+  <w:num w:numId="7" w16cid:durableId="1848404982">
+    <w:abstractNumId w:val="1"/>
   </w:num>
-  <w:num w:numId="4" w16cid:durableId="895050971">
+  <w:num w:numId="8" w16cid:durableId="1139302046">
     <w:abstractNumId w:val="0"/>
   </w:num>
-  <w:num w:numId="5" w16cid:durableId="1011791">
-    <w:abstractNumId w:val="8"/>
-  </w:num>
-  <w:num w:numId="6" w16cid:durableId="1181431789">
-    <w:abstractNumId w:val="4"/>
-  </w:num>
-  <w:num w:numId="7" w16cid:durableId="685592867">
+  <w:num w:numId="9" w16cid:durableId="1786655447">
     <w:abstractNumId w:val="2"/>
-  </w:num>
-  <w:num w:numId="8" w16cid:durableId="443576865">
-    <w:abstractNumId w:val="6"/>
-  </w:num>
-  <w:num w:numId="9" w16cid:durableId="2130540537">
-    <w:abstractNumId w:val="1"/>
   </w:num>
 </w:numbering>
 </file>
@@ -5425,7 +5425,7 @@
     <w:link w:val="a6"/>
     <w:uiPriority w:val="99"/>
     <w:unhideWhenUsed/>
-    <w:rsid w:val="00B528EC"/>
+    <w:rsid w:val="00403ED4"/>
     <w:pPr>
       <w:tabs>
         <w:tab w:val="center" w:pos="4153"/>
@@ -5444,7 +5444,7 @@
     <w:basedOn w:val="a0"/>
     <w:link w:val="a5"/>
     <w:uiPriority w:val="99"/>
-    <w:rsid w:val="00B528EC"/>
+    <w:rsid w:val="00403ED4"/>
     <w:rPr>
       <w:rFonts w:ascii="宋体" w:eastAsia="宋体" w:hAnsi="宋体" w:cs="宋体"/>
       <w:sz w:val="18"/>
@@ -5457,7 +5457,7 @@
     <w:link w:val="a8"/>
     <w:uiPriority w:val="99"/>
     <w:unhideWhenUsed/>
-    <w:rsid w:val="00B528EC"/>
+    <w:rsid w:val="00403ED4"/>
     <w:pPr>
       <w:tabs>
         <w:tab w:val="center" w:pos="4153"/>
@@ -5475,7 +5475,7 @@
     <w:basedOn w:val="a0"/>
     <w:link w:val="a7"/>
     <w:uiPriority w:val="99"/>
-    <w:rsid w:val="00B528EC"/>
+    <w:rsid w:val="00403ED4"/>
     <w:rPr>
       <w:rFonts w:ascii="宋体" w:eastAsia="宋体" w:hAnsi="宋体" w:cs="宋体"/>
       <w:sz w:val="18"/>

</xml_diff>